<commit_message>
add Schwierigkeiten & Änderungen im Code in Bericht01
</commit_message>
<xml_diff>
--- a/docs/erweiterung/bericht01.docx
+++ b/docs/erweiterung/bericht01.docx
@@ -114,6 +114,9 @@
         <w:ind w:left="360"/>
       </w:pPr>
       <w:r>
+        <w:rPr>
+          <w:noProof/>
+        </w:rPr>
         <w:drawing>
           <wp:inline distT="0" distB="0" distL="0" distR="0" wp14:anchorId="58E061E6" wp14:editId="2D5C6F01">
             <wp:extent cx="5760720" cy="1610995"/>
@@ -237,6 +240,9 @@
         <w:ind w:left="360"/>
       </w:pPr>
       <w:r>
+        <w:rPr>
+          <w:noProof/>
+        </w:rPr>
         <w:drawing>
           <wp:inline distT="0" distB="0" distL="0" distR="0" wp14:anchorId="672C229F" wp14:editId="74239639">
             <wp:extent cx="5760720" cy="1432560"/>
@@ -339,6 +345,9 @@
         <w:ind w:left="360"/>
       </w:pPr>
       <w:r>
+        <w:rPr>
+          <w:noProof/>
+        </w:rPr>
         <w:drawing>
           <wp:inline distT="0" distB="0" distL="0" distR="0" wp14:anchorId="53CF52C0" wp14:editId="457D908E">
             <wp:extent cx="5760720" cy="1398905"/>
@@ -441,6 +450,9 @@
         <w:ind w:left="360"/>
       </w:pPr>
       <w:r>
+        <w:rPr>
+          <w:noProof/>
+        </w:rPr>
         <w:lastRenderedPageBreak/>
         <w:drawing>
           <wp:inline distT="0" distB="0" distL="0" distR="0" wp14:anchorId="7D0D26AD" wp14:editId="38E21AA0">
@@ -547,6 +559,9 @@
         <w:ind w:left="360"/>
       </w:pPr>
       <w:r>
+        <w:rPr>
+          <w:noProof/>
+        </w:rPr>
         <w:drawing>
           <wp:inline distT="0" distB="0" distL="0" distR="0" wp14:anchorId="0685EC86" wp14:editId="33C5EE54">
             <wp:extent cx="5760720" cy="2957830"/>
@@ -649,6 +664,9 @@
         <w:ind w:left="360"/>
       </w:pPr>
       <w:r>
+        <w:rPr>
+          <w:noProof/>
+        </w:rPr>
         <w:drawing>
           <wp:inline distT="0" distB="0" distL="0" distR="0" wp14:anchorId="34D97C28" wp14:editId="112A6973">
             <wp:extent cx="5760720" cy="2682875"/>
@@ -764,6 +782,9 @@
         <w:ind w:left="360"/>
       </w:pPr>
       <w:r>
+        <w:rPr>
+          <w:noProof/>
+        </w:rPr>
         <w:drawing>
           <wp:inline distT="0" distB="0" distL="0" distR="0" wp14:anchorId="41D0B206" wp14:editId="34E0ABA1">
             <wp:extent cx="5760720" cy="1637030"/>
@@ -870,13 +891,7 @@
         <w:ind w:left="360"/>
       </w:pPr>
       <w:r>
-        <w:t>In diesem Test haben wir die Methode «TeacherSubject</w:t>
-      </w:r>
-      <w:r>
-        <w:t>Remove</w:t>
-      </w:r>
-      <w:r>
-        <w:t xml:space="preserve">» geprüft und </w:t>
+        <w:t xml:space="preserve">In diesem Test haben wir die Methode «TeacherSubjectRemove» geprüft und </w:t>
       </w:r>
       <w:r>
         <w:t>geschaut,</w:t>
@@ -897,6 +912,9 @@
         <w:ind w:left="360"/>
       </w:pPr>
       <w:r>
+        <w:rPr>
+          <w:noProof/>
+        </w:rPr>
         <w:drawing>
           <wp:inline distT="0" distB="0" distL="0" distR="0" wp14:anchorId="5BD1CDF1" wp14:editId="52AEDFE4">
             <wp:extent cx="5760720" cy="1967230"/>
@@ -965,6 +983,70 @@
       <w:pPr>
         <w:spacing w:after="0"/>
         <w:ind w:left="360"/>
+      </w:pPr>
+      <w:r>
+        <w:t xml:space="preserve">Am Anfang beim Testen war das Problem das die meisten Klassen, auf internal gesetzt waren, welche dann nicht genutzt werden konnten in MS-Test. Da </w:t>
+      </w:r>
+      <w:r>
+        <w:t>habe</w:t>
+      </w:r>
+      <w:r>
+        <w:t xml:space="preserve"> ich probiert in den Properties vom Hauptprojekt das Testprojekt zu inkludieren, dies hat aber nicht funktioniert. Deswegen musste ich alle Klassen vom Hauptprojekt auf </w:t>
+      </w:r>
+      <w:proofErr w:type="spellStart"/>
+      <w:r>
+        <w:t>public</w:t>
+      </w:r>
+      <w:proofErr w:type="spellEnd"/>
+      <w:r>
+        <w:t xml:space="preserve"> setzten. Eine weitere Schwierigkeit war noch das Testen der Validation im Algorithmus, das war eine Methode, welche private war und deshalb nicht zugreifbar war von Testklasse aus. Um das zu lösen habe ich die Validation in eine eigene Klasse exportiert, welche dann auch zugreifbar war von Testklasse aus. Bei der Test Method Error bei zu wenigen Daten, gab es immer die </w:t>
+      </w:r>
+      <w:proofErr w:type="spellStart"/>
+      <w:r>
+        <w:t>Exception</w:t>
+      </w:r>
+      <w:proofErr w:type="spellEnd"/>
+      <w:r>
+        <w:t xml:space="preserve"> vor dem </w:t>
+      </w:r>
+      <w:proofErr w:type="spellStart"/>
+      <w:r>
+        <w:t>Assert</w:t>
+      </w:r>
+      <w:proofErr w:type="spellEnd"/>
+      <w:r>
+        <w:t xml:space="preserve">. Das </w:t>
+      </w:r>
+      <w:r>
+        <w:t>habe</w:t>
+      </w:r>
+      <w:r>
+        <w:t xml:space="preserve"> ich dann so gelöst das ich </w:t>
+      </w:r>
+      <w:r>
+        <w:t xml:space="preserve">die Methode, welche die </w:t>
+      </w:r>
+      <w:proofErr w:type="spellStart"/>
+      <w:r>
+        <w:t>Exception</w:t>
+      </w:r>
+      <w:proofErr w:type="spellEnd"/>
+      <w:r>
+        <w:t xml:space="preserve"> auslösen soll innerhalb des </w:t>
+      </w:r>
+      <w:proofErr w:type="spellStart"/>
+      <w:r>
+        <w:t>Asserts</w:t>
+      </w:r>
+      <w:proofErr w:type="spellEnd"/>
+      <w:r>
+        <w:t xml:space="preserve"> ausgeführt habe. </w:t>
+      </w:r>
+    </w:p>
+    <w:p>
+      <w:pPr>
+        <w:spacing w:after="0"/>
+        <w:ind w:left="360"/>
         <w:rPr>
           <w:b/>
           <w:bCs/>
@@ -990,6 +1072,16 @@
           <w:szCs w:val="56"/>
         </w:rPr>
         <w:t>Was wurde im Code angepasst</w:t>
+      </w:r>
+    </w:p>
+    <w:p>
+      <w:pPr>
+        <w:spacing w:after="0"/>
+        <w:ind w:left="360"/>
+      </w:pPr>
+      <w:r>
+        <w:lastRenderedPageBreak/>
+        <w:t xml:space="preserve">Es musste nicht grossartig viel angepasst werden im Originalcode, aber eines der Sachen ist das ich eine neue Klasse im Unit-Test Ordner hinzufügen musste, welcher alle Testdaten enthielt. Dieser war nämlich nicht von Zugreifbar von der Testklasse aus. Im Haupt Projekt musste ich paar Zeilen im Algorithmus fixen, weil es kleinere Fehler gab, weshalb die Unit-Tests fehlschlugen. </w:t>
       </w:r>
     </w:p>
     <w:p>

</xml_diff>

<commit_message>
Update bericht01 & Klassendiagramm
</commit_message>
<xml_diff>
--- a/docs/erweiterung/bericht01.docx
+++ b/docs/erweiterung/bericht01.docx
@@ -221,7 +221,17 @@
         <w:t>dieses</w:t>
       </w:r>
       <w:r>
-        <w:t xml:space="preserve"> mal nur mit Räumen.</w:t>
+        <w:t xml:space="preserve"> </w:t>
+      </w:r>
+      <w:proofErr w:type="spellStart"/>
+      <w:proofErr w:type="gramStart"/>
+      <w:r>
+        <w:t>mal</w:t>
+      </w:r>
+      <w:proofErr w:type="spellEnd"/>
+      <w:proofErr w:type="gramEnd"/>
+      <w:r>
+        <w:t xml:space="preserve"> nur mit Räumen.</w:t>
       </w:r>
     </w:p>
     <w:p>
@@ -733,13 +743,23 @@
         </w:rPr>
         <w:t xml:space="preserve"> </w:t>
       </w:r>
-      <w:r>
-        <w:rPr>
-          <w:sz w:val="32"/>
-          <w:szCs w:val="32"/>
-          <w:u w:val="single"/>
-        </w:rPr>
-        <w:t>TeacherSubjectAdd testen</w:t>
+      <w:proofErr w:type="spellStart"/>
+      <w:r>
+        <w:rPr>
+          <w:sz w:val="32"/>
+          <w:szCs w:val="32"/>
+          <w:u w:val="single"/>
+        </w:rPr>
+        <w:t>TeacherSubjectAdd</w:t>
+      </w:r>
+      <w:proofErr w:type="spellEnd"/>
+      <w:r>
+        <w:rPr>
+          <w:sz w:val="32"/>
+          <w:szCs w:val="32"/>
+          <w:u w:val="single"/>
+        </w:rPr>
+        <w:t xml:space="preserve"> testen</w:t>
       </w:r>
     </w:p>
     <w:p>
@@ -751,7 +771,15 @@
         <w:t xml:space="preserve">In diesem Test haben wir die Methode </w:t>
       </w:r>
       <w:r>
-        <w:t xml:space="preserve">«TeacherSubjectAdd» geprüft und </w:t>
+        <w:t>«</w:t>
+      </w:r>
+      <w:proofErr w:type="spellStart"/>
+      <w:r>
+        <w:t>TeacherSubjectAdd</w:t>
+      </w:r>
+      <w:proofErr w:type="spellEnd"/>
+      <w:r>
+        <w:t xml:space="preserve">» geprüft und </w:t>
       </w:r>
       <w:r>
         <w:t>geschaut,</w:t>
@@ -850,6 +878,7 @@
         </w:rPr>
         <w:t xml:space="preserve"> </w:t>
       </w:r>
+      <w:proofErr w:type="spellStart"/>
       <w:r>
         <w:rPr>
           <w:sz w:val="32"/>
@@ -866,6 +895,7 @@
         </w:rPr>
         <w:t>Remove</w:t>
       </w:r>
+      <w:proofErr w:type="spellEnd"/>
       <w:r>
         <w:rPr>
           <w:sz w:val="32"/>
@@ -881,7 +911,15 @@
         <w:ind w:left="360"/>
       </w:pPr>
       <w:r>
-        <w:t xml:space="preserve">In diesem Test haben wir die Methode «TeacherSubjectRemove» geprüft und </w:t>
+        <w:t>In diesem Test haben wir die Methode «</w:t>
+      </w:r>
+      <w:proofErr w:type="spellStart"/>
+      <w:r>
+        <w:t>TeacherSubjectRemove</w:t>
+      </w:r>
+      <w:proofErr w:type="spellEnd"/>
+      <w:r>
+        <w:t xml:space="preserve">» geprüft und </w:t>
       </w:r>
       <w:r>
         <w:t>geschaut,</w:t>
@@ -981,7 +1019,31 @@
         <w:t>habe</w:t>
       </w:r>
       <w:r>
-        <w:t xml:space="preserve"> ich probiert in den Properties vom Hauptprojekt das Testprojekt zu inkludieren, dies hat aber nicht funktioniert. Deswegen musste ich alle Klassen vom Hauptprojekt auf public setzten. Eine weitere Schwierigkeit war noch das Testen der Validation im Algorithmus, das war eine Methode, welche private war und deshalb nicht zugreifbar war von Testklasse aus. Um das zu lösen habe ich die Validation in eine eigene Klasse exportiert, welche dann auch zugreifbar war von Testklasse aus. Bei der Test Method Error bei zu wenigen Daten, gab es immer die Exception vor dem Assert. Das </w:t>
+        <w:t xml:space="preserve"> ich probiert in den Properties vom Hauptprojekt das Testprojekt zu inkludieren, dies hat aber nicht funktioniert. Deswegen musste ich alle Klassen vom Hauptprojekt auf </w:t>
+      </w:r>
+      <w:proofErr w:type="spellStart"/>
+      <w:r>
+        <w:t>public</w:t>
+      </w:r>
+      <w:proofErr w:type="spellEnd"/>
+      <w:r>
+        <w:t xml:space="preserve"> setzten. Eine weitere Schwierigkeit war noch das Testen der Validation im Algorithmus, das war eine Methode, welche private war und deshalb nicht zugreifbar war von Testklasse aus. Um das zu lösen habe ich die Validation in eine eigene Klasse exportiert, welche dann auch zugreifbar war von Testklasse aus. Bei der Test Method Error bei zu wenigen Daten, gab es immer die </w:t>
+      </w:r>
+      <w:proofErr w:type="spellStart"/>
+      <w:r>
+        <w:t>Exception</w:t>
+      </w:r>
+      <w:proofErr w:type="spellEnd"/>
+      <w:r>
+        <w:t xml:space="preserve"> vor dem </w:t>
+      </w:r>
+      <w:proofErr w:type="spellStart"/>
+      <w:r>
+        <w:t>Assert</w:t>
+      </w:r>
+      <w:proofErr w:type="spellEnd"/>
+      <w:r>
+        <w:t xml:space="preserve">. Das </w:t>
       </w:r>
       <w:r>
         <w:t>habe</w:t>
@@ -990,7 +1052,23 @@
         <w:t xml:space="preserve"> ich dann so gelöst das ich </w:t>
       </w:r>
       <w:r>
-        <w:t xml:space="preserve">die Methode, welche die Exception auslösen soll innerhalb des Asserts ausgeführt habe. </w:t>
+        <w:t xml:space="preserve">die Methode, welche die </w:t>
+      </w:r>
+      <w:proofErr w:type="spellStart"/>
+      <w:r>
+        <w:t>Exception</w:t>
+      </w:r>
+      <w:proofErr w:type="spellEnd"/>
+      <w:r>
+        <w:t xml:space="preserve"> auslösen soll innerhalb des </w:t>
+      </w:r>
+      <w:proofErr w:type="spellStart"/>
+      <w:r>
+        <w:t>Asserts</w:t>
+      </w:r>
+      <w:proofErr w:type="spellEnd"/>
+      <w:r>
+        <w:t xml:space="preserve"> ausgeführt habe. </w:t>
       </w:r>
     </w:p>
     <w:p>
@@ -1082,7 +1160,27 @@
           <w:sz w:val="56"/>
           <w:szCs w:val="56"/>
         </w:rPr>
-        <w:t>Implementation vom Plugin System (Strategy Pattern)</w:t>
+        <w:t>Implementation vom Plugin System (</w:t>
+      </w:r>
+      <w:proofErr w:type="spellStart"/>
+      <w:r>
+        <w:rPr>
+          <w:b/>
+          <w:bCs/>
+          <w:sz w:val="56"/>
+          <w:szCs w:val="56"/>
+        </w:rPr>
+        <w:t>Strategy</w:t>
+      </w:r>
+      <w:proofErr w:type="spellEnd"/>
+      <w:r>
+        <w:rPr>
+          <w:b/>
+          <w:bCs/>
+          <w:sz w:val="56"/>
+          <w:szCs w:val="56"/>
+        </w:rPr>
+        <w:t xml:space="preserve"> Pattern)</w:t>
       </w:r>
     </w:p>
     <w:p>
@@ -1127,18 +1225,176 @@
         <w:ind w:left="360"/>
       </w:pPr>
       <w:r>
-        <w:t>Ich habe mich erstmal erkundigt, was ein Strategy Pattern ist und wie es verwendet wird, um den Code sauber und wartungsfähig zu halten. Danach habe ich im Hauptprojekt das Interface IScheduleEvaluator angepasst. Was die Valuatoren haben sollten und habe mich drangemacht die Klassen für die Valuatoren zu coden, welche vom Interface erben. Die Aufgabe war jetzt die Validation in den Klassen auszuprogrammieren. Das war der grösste Teil des Ganzen. Als ich damit fertig war und die Klassen die Ausgabe der Bewertung machen konnten.</w:t>
-      </w:r>
-    </w:p>
-    <w:p>
-      <w:pPr>
-        <w:spacing w:after="0"/>
-        <w:ind w:left="360"/>
-        <w:rPr>
-          <w:b/>
-          <w:bCs/>
-        </w:rPr>
-      </w:pPr>
+        <w:t xml:space="preserve">Ich habe mich erstmal erkundigt, was ein </w:t>
+      </w:r>
+      <w:proofErr w:type="spellStart"/>
+      <w:r>
+        <w:t>Strategy</w:t>
+      </w:r>
+      <w:proofErr w:type="spellEnd"/>
+      <w:r>
+        <w:t xml:space="preserve"> Pattern ist und wie es verwendet wird, um den Code sauber und wartungsfähig zu halten. Danach habe ich im Hauptprojekt das Interface </w:t>
+      </w:r>
+      <w:proofErr w:type="spellStart"/>
+      <w:r>
+        <w:t>IScheduleEvaluator</w:t>
+      </w:r>
+      <w:proofErr w:type="spellEnd"/>
+      <w:r>
+        <w:t xml:space="preserve"> angepasst. Was die </w:t>
+      </w:r>
+      <w:proofErr w:type="spellStart"/>
+      <w:r>
+        <w:t>Valuatoren</w:t>
+      </w:r>
+      <w:proofErr w:type="spellEnd"/>
+      <w:r>
+        <w:t xml:space="preserve"> haben sollten und habe mich drangemacht die Klassen für die </w:t>
+      </w:r>
+      <w:proofErr w:type="spellStart"/>
+      <w:r>
+        <w:t>Valuatoren</w:t>
+      </w:r>
+      <w:proofErr w:type="spellEnd"/>
+      <w:r>
+        <w:t xml:space="preserve"> zu coden, welche vom Interface erben. Die Aufgabe war jetzt die Validation in den Klassen </w:t>
+      </w:r>
+      <w:proofErr w:type="spellStart"/>
+      <w:r>
+        <w:t>auszuprogrammieren</w:t>
+      </w:r>
+      <w:proofErr w:type="spellEnd"/>
+      <w:r>
+        <w:t>. Das war der grösste Teil des Ganzen. Als ich damit fertig war und die Klassen die Ausgabe der Bewertung machen konnten</w:t>
+      </w:r>
+      <w:r>
+        <w:t xml:space="preserve">, habe ich diese in eine Liste gepackt. Danach habe ich die Optionen in das User Interface aufgenommen, wo man dann auswählen konnte, welche Optionen momentan aktiv sein sollten. Zum Schluss habe ich Unit Tests eingefügt für zwei der neuen Klassen, um ihre Funktionalität zu testen. </w:t>
+      </w:r>
+    </w:p>
+    <w:p>
+      <w:pPr>
+        <w:spacing w:after="0"/>
+        <w:ind w:left="360"/>
+      </w:pPr>
+    </w:p>
+    <w:p>
+      <w:pPr>
+        <w:spacing w:after="0"/>
+        <w:ind w:left="360"/>
+        <w:rPr>
+          <w:b/>
+          <w:bCs/>
+          <w:sz w:val="32"/>
+          <w:szCs w:val="32"/>
+        </w:rPr>
+      </w:pPr>
+      <w:r>
+        <w:rPr>
+          <w:b/>
+          <w:bCs/>
+          <w:sz w:val="32"/>
+          <w:szCs w:val="32"/>
+        </w:rPr>
+        <w:t>Vorteile eines Plugin Systems</w:t>
+      </w:r>
+    </w:p>
+    <w:p>
+      <w:pPr>
+        <w:spacing w:after="0"/>
+        <w:ind w:left="360"/>
+      </w:pPr>
+      <w:r>
+        <w:t xml:space="preserve">Mit der Integration des Plugin Systems sind wir jetzt in der Lage jederzeit neue Validationen zu generieren und hinzuzufügen, ohne Probleme. Wir müssen nichts im Algorithmus anpassen, sondern einfach nur der Liste die neue Klasse ergänzen. Was zu beachten ist, dass die Klasse das Interface </w:t>
+      </w:r>
+      <w:proofErr w:type="spellStart"/>
+      <w:r>
+        <w:t>IScheduleEvaluator</w:t>
+      </w:r>
+      <w:proofErr w:type="spellEnd"/>
+      <w:r>
+        <w:t xml:space="preserve"> implementiert haben muss. Eines der besten Vorteile ist, die Wartbarkeit des Codes und die einfache Erweiterbarkeit. </w:t>
+      </w:r>
+    </w:p>
+    <w:p>
+      <w:pPr>
+        <w:spacing w:after="0"/>
+        <w:ind w:left="360"/>
+      </w:pPr>
+    </w:p>
+    <w:p>
+      <w:pPr>
+        <w:spacing w:after="0"/>
+        <w:ind w:left="360"/>
+        <w:rPr>
+          <w:b/>
+          <w:bCs/>
+          <w:sz w:val="32"/>
+          <w:szCs w:val="32"/>
+          <w:lang w:val="de-DE"/>
+        </w:rPr>
+      </w:pPr>
+      <w:r>
+        <w:rPr>
+          <w:b/>
+          <w:bCs/>
+          <w:sz w:val="32"/>
+          <w:szCs w:val="32"/>
+        </w:rPr>
+        <w:t>Schwierigkeiten bei der Implementation</w:t>
+      </w:r>
+    </w:p>
+    <w:p>
+      <w:pPr>
+        <w:spacing w:after="0"/>
+        <w:ind w:left="360"/>
+      </w:pPr>
+      <w:r>
+        <w:t xml:space="preserve">Die Hauptschwierigkeit in der Einbindung war es zu verstehen, wie ein </w:t>
+      </w:r>
+      <w:proofErr w:type="spellStart"/>
+      <w:r>
+        <w:t>Strategy</w:t>
+      </w:r>
+      <w:proofErr w:type="spellEnd"/>
+      <w:r>
+        <w:t xml:space="preserve"> Pattern funktioniert und für was es gebraucht wird. Dafür musste ich mich Erkundigen mit YouTube Videos, welche das gut Illustriert haben. Dazu hatte ich noch das Problem bei der Einbindung mit dem UI wie ich die verschiedenen </w:t>
+      </w:r>
+      <w:r>
+        <w:lastRenderedPageBreak/>
+        <w:t xml:space="preserve">Validationen an- / ausschalten sollte. Schlussendlich habe ich mich entschieden die Liste zu einem Tupel zu machen mit zwei Objekten, der Klasse </w:t>
+      </w:r>
+      <w:proofErr w:type="gramStart"/>
+      <w:r>
+        <w:t>selber</w:t>
+      </w:r>
+      <w:proofErr w:type="gramEnd"/>
+      <w:r>
+        <w:t xml:space="preserve"> und einem </w:t>
+      </w:r>
+      <w:proofErr w:type="spellStart"/>
+      <w:r>
+        <w:t>bool</w:t>
+      </w:r>
+      <w:proofErr w:type="spellEnd"/>
+      <w:r>
+        <w:t xml:space="preserve">, welches </w:t>
+      </w:r>
+      <w:proofErr w:type="spellStart"/>
+      <w:r>
+        <w:t>true</w:t>
+      </w:r>
+      <w:proofErr w:type="spellEnd"/>
+      <w:r>
+        <w:t xml:space="preserve"> oder </w:t>
+      </w:r>
+      <w:proofErr w:type="spellStart"/>
+      <w:r>
+        <w:t>false</w:t>
+      </w:r>
+      <w:proofErr w:type="spellEnd"/>
+      <w:r>
+        <w:t xml:space="preserve"> sein kann, ob es an oder aus ist.</w:t>
+      </w:r>
     </w:p>
     <w:sectPr>
       <w:pgSz w:w="11906" w:h="16838"/>
@@ -1851,6 +2107,7 @@
   <w:style w:type="character" w:default="1" w:styleId="Absatz-Standardschriftart">
     <w:name w:val="Default Paragraph Font"/>
     <w:uiPriority w:val="1"/>
+    <w:semiHidden/>
     <w:unhideWhenUsed/>
   </w:style>
   <w:style w:type="table" w:default="1" w:styleId="NormaleTabelle">

</xml_diff>